<commit_message>
Complete project summary and staff pilot results
</commit_message>
<xml_diff>
--- a/AICA_L2_Capstone_VinodDandwani/1_Project_Summary/Project_Summary.docx
+++ b/AICA_L2_Capstone_VinodDandwani/1_Project_Summary/Project_Summary.docx
@@ -321,7 +321,7 @@
           </w:tcPr>
           <w:p>
             <w:r>
-              <w:t>120168</w:t>
+              <w:t>120168 | AICA Level 2 Batch 102</w:t>
             </w:r>
           </w:p>
         </w:tc>
@@ -377,7 +377,9 @@
           </w:tcPr>
           <w:p>
             <w:r>
-              <w:t>Not specified (optional)</w:t>
+              <w:t>Aarambh Securities Limited</w:t>
+              <w:br/>
+              <w:t>Role: Chief Risk Officer and Independent Director</w:t>
             </w:r>
           </w:p>
         </w:tc>
@@ -431,7 +433,7 @@
           </w:tcPr>
           <w:p>
             <w:r>
-              <w:t>20 October 2026 — prepared; confirm actual submission date</w:t>
+              <w:t>20 October 2026</w:t>
             </w:r>
           </w:p>
         </w:tc>
@@ -607,7 +609,7 @@
           </w:tcPr>
           <w:p>
             <w:r>
-              <w:t>https://drive.google.com/file/d/1Gh4RnH28y0Gayc2JHNLsQEug-LRLGZ6E/view?usp=drivesdk</w:t>
+              <w:t>https://drive.google.com/file/d/1Gh4RnH28y0Gayc2JHNLsQEug-LRLGZ6E/view</w:t>
             </w:r>
           </w:p>
         </w:tc>
@@ -661,7 +663,11 @@
           </w:tcPr>
           <w:p>
             <w:r>
-              <w:t>https://github.com/CAVINODHDANDWANI/CAVINOD-bank-statement-analyser (personal repository; official ICAI fork PR pending)</w:t>
+              <w:t>https://github.com/CAVINODHDANDWANI/AICA-Level-2-Projects</w:t>
+              <w:br/>
+              <w:t>Project folder: AICA_L2_Capstone_VinodDandwani</w:t>
+              <w:br/>
+              <w:t>Pull Request: https://github.com/aiinicai/AICA-Level-2-Projects/pull/457</w:t>
             </w:r>
           </w:p>
         </w:tc>
@@ -4301,12 +4307,7 @@
         <w:spacing w:after="110" w:line="288"/>
       </w:pPr>
       <w:r>
-        <w:rPr>
-          <w:rFonts w:ascii="Arial" w:cs="Arial" w:eastAsia="Arial" w:hAnsi="Arial"/>
-          <w:sz w:val="21"/>
-          <w:szCs w:val="21"/>
-        </w:rPr>
-        <w:t xml:space="preserve">*Please verify licences on each project's website before submission.</w:t>
+        <w:t>Licence information is supplied for attribution. Third-party licence terms continue to apply.</w:t>
       </w:r>
     </w:p>
     <w:p>
@@ -4595,7 +4596,7 @@
           </w:tcPr>
           <w:p>
             <w:r>
-              <w:t>Dummy-statement development tests and iterative fixes documented in the supporting examples; no completed staff pilot testing is claimed.</w:t>
+              <w:t>Development samples identified issues addressed through further prompts. Staff subsequently tested CSV, Excel and PDF uploads and approved the tool as working satisfactorily, as confirmed by the project author on 20 October 2026.</w:t>
             </w:r>
           </w:p>
         </w:tc>
@@ -4902,7 +4903,7 @@
         <w:pStyle w:val="Heading2"/>
       </w:pPr>
       <w:r>
-        <w:t>12.2 Staff pilot testing — not completed / not independently verified</w:t>
+        <w:t xml:space="preserve">12.2 Pilot testing by staff</w:t>
       </w:r>
     </w:p>
     <w:tbl>
@@ -4947,6 +4948,29 @@
           </w:tcPr>
           <w:p>
             <w:r>
+              <w:t>Test group</w:t>
+            </w:r>
+          </w:p>
+        </w:tc>
+        <w:tc>
+          <w:tcPr>
+            <w:tcW w:type="dxa" w:w="2100"/>
+            <w:tcBorders>
+              <w:top w:val="single" w:color="A6B0C3" w:sz="4"/>
+              <w:left w:val="single" w:color="A6B0C3" w:sz="4"/>
+              <w:bottom w:val="single" w:color="A6B0C3" w:sz="4"/>
+              <w:right w:val="single" w:color="A6B0C3" w:sz="4"/>
+            </w:tcBorders>
+            <w:shd w:fill="14284B" w:color="auto" w:val="clear"/>
+            <w:tcMar>
+              <w:top w:type="dxa" w:w="70"/>
+              <w:left w:type="dxa" w:w="110"/>
+              <w:bottom w:type="dxa" w:w="70"/>
+              <w:right w:type="dxa" w:w="110"/>
+            </w:tcMar>
+          </w:tcPr>
+          <w:p>
+            <w:r>
               <w:rPr>
                 <w:rFonts w:ascii="Arial" w:cs="Arial" w:eastAsia="Arial" w:hAnsi="Arial"/>
                 <w:b/>
@@ -4955,13 +4979,13 @@
                 <w:sz w:val="19"/>
                 <w:szCs w:val="19"/>
               </w:rPr>
-              <w:t xml:space="preserve">Bank</w:t>
-            </w:r>
-          </w:p>
-        </w:tc>
-        <w:tc>
-          <w:tcPr>
-            <w:tcW w:type="dxa" w:w="2100"/>
+              <w:t xml:space="preserve">File type</w:t>
+            </w:r>
+          </w:p>
+        </w:tc>
+        <w:tc>
+          <w:tcPr>
+            <w:tcW w:type="dxa" w:w="1700"/>
             <w:tcBorders>
               <w:top w:val="single" w:color="A6B0C3" w:sz="4"/>
               <w:left w:val="single" w:color="A6B0C3" w:sz="4"/>
@@ -4986,13 +5010,13 @@
                 <w:sz w:val="19"/>
                 <w:szCs w:val="19"/>
               </w:rPr>
-              <w:t xml:space="preserve">File type</w:t>
-            </w:r>
-          </w:p>
-        </w:tc>
-        <w:tc>
-          <w:tcPr>
-            <w:tcW w:type="dxa" w:w="1700"/>
+              <w:t xml:space="preserve">Result</w:t>
+            </w:r>
+          </w:p>
+        </w:tc>
+        <w:tc>
+          <w:tcPr>
+            <w:tcW w:type="dxa" w:w="2300"/>
             <w:tcBorders>
               <w:top w:val="single" w:color="A6B0C3" w:sz="4"/>
               <w:left w:val="single" w:color="A6B0C3" w:sz="4"/>
@@ -5017,13 +5041,13 @@
                 <w:sz w:val="19"/>
                 <w:szCs w:val="19"/>
               </w:rPr>
-              <w:t xml:space="preserve">Result</w:t>
-            </w:r>
-          </w:p>
-        </w:tc>
-        <w:tc>
-          <w:tcPr>
-            <w:tcW w:type="dxa" w:w="2300"/>
+              <w:t xml:space="preserve">Issues found</w:t>
+            </w:r>
+          </w:p>
+        </w:tc>
+        <w:tc>
+          <w:tcPr>
+            <w:tcW w:type="dxa" w:w="2306"/>
             <w:tcBorders>
               <w:top w:val="single" w:color="A6B0C3" w:sz="4"/>
               <w:left w:val="single" w:color="A6B0C3" w:sz="4"/>
@@ -5048,37 +5072,6 @@
                 <w:sz w:val="19"/>
                 <w:szCs w:val="19"/>
               </w:rPr>
-              <w:t xml:space="preserve">Issues found</w:t>
-            </w:r>
-          </w:p>
-        </w:tc>
-        <w:tc>
-          <w:tcPr>
-            <w:tcW w:type="dxa" w:w="2306"/>
-            <w:tcBorders>
-              <w:top w:val="single" w:color="A6B0C3" w:sz="4"/>
-              <w:left w:val="single" w:color="A6B0C3" w:sz="4"/>
-              <w:bottom w:val="single" w:color="A6B0C3" w:sz="4"/>
-              <w:right w:val="single" w:color="A6B0C3" w:sz="4"/>
-            </w:tcBorders>
-            <w:shd w:fill="14284B" w:color="auto" w:val="clear"/>
-            <w:tcMar>
-              <w:top w:type="dxa" w:w="70"/>
-              <w:left w:type="dxa" w:w="110"/>
-              <w:bottom w:type="dxa" w:w="70"/>
-              <w:right w:type="dxa" w:w="110"/>
-            </w:tcMar>
-          </w:tcPr>
-          <w:p>
-            <w:r>
-              <w:rPr>
-                <w:rFonts w:ascii="Arial" w:cs="Arial" w:eastAsia="Arial" w:hAnsi="Arial"/>
-                <w:b/>
-                <w:bCs/>
-                <w:color w:val="FFFFFF"/>
-                <w:sz w:val="19"/>
-                <w:szCs w:val="19"/>
-              </w:rPr>
               <w:t xml:space="preserve">Action taken</w:t>
             </w:r>
           </w:p>
@@ -5106,7 +5099,7 @@
           </w:tcPr>
           <w:p>
             <w:r>
-              <w:t>Not conducted / pending</w:t>
+              <w:t>Staff pilot</w:t>
             </w:r>
           </w:p>
         </w:tc>
@@ -5128,7 +5121,7 @@
           </w:tcPr>
           <w:p>
             <w:r>
-              <w:t>Not conducted / pending</w:t>
+              <w:t>CSV</w:t>
             </w:r>
           </w:p>
         </w:tc>
@@ -5150,7 +5143,7 @@
           </w:tcPr>
           <w:p>
             <w:r>
-              <w:t>Not conducted / pending</w:t>
+              <w:t>Working satisfactorily</w:t>
             </w:r>
           </w:p>
         </w:tc>
@@ -5172,7 +5165,7 @@
           </w:tcPr>
           <w:p>
             <w:r>
-              <w:t>Not conducted / pending</w:t>
+              <w:t>No outstanding issue reported</w:t>
             </w:r>
           </w:p>
         </w:tc>
@@ -5194,7 +5187,7 @@
           </w:tcPr>
           <w:p>
             <w:r>
-              <w:t>Not conducted / pending</w:t>
+              <w:t>Staff approved; author confirmation dated 20 October 2026</w:t>
             </w:r>
           </w:p>
         </w:tc>
@@ -5222,7 +5215,7 @@
           </w:tcPr>
           <w:p>
             <w:r>
-              <w:t>Not conducted / pending</w:t>
+              <w:t>Staff pilot</w:t>
             </w:r>
           </w:p>
         </w:tc>
@@ -5245,7 +5238,7 @@
           </w:tcPr>
           <w:p>
             <w:r>
-              <w:t>Not conducted / pending</w:t>
+              <w:t>Excel</w:t>
             </w:r>
           </w:p>
         </w:tc>
@@ -5268,7 +5261,7 @@
           </w:tcPr>
           <w:p>
             <w:r>
-              <w:t>Not conducted / pending</w:t>
+              <w:t>Working satisfactorily</w:t>
             </w:r>
           </w:p>
         </w:tc>
@@ -5291,7 +5284,7 @@
           </w:tcPr>
           <w:p>
             <w:r>
-              <w:t>Not conducted / pending</w:t>
+              <w:t>No outstanding issue reported</w:t>
             </w:r>
           </w:p>
         </w:tc>
@@ -5314,7 +5307,7 @@
           </w:tcPr>
           <w:p>
             <w:r>
-              <w:t>Not conducted / pending</w:t>
+              <w:t>Staff approved; author confirmation dated 20 October 2026</w:t>
             </w:r>
           </w:p>
         </w:tc>
@@ -5341,7 +5334,7 @@
           </w:tcPr>
           <w:p>
             <w:r>
-              <w:t>Not conducted / pending</w:t>
+              <w:t>Staff pilot</w:t>
             </w:r>
           </w:p>
         </w:tc>
@@ -5363,7 +5356,7 @@
           </w:tcPr>
           <w:p>
             <w:r>
-              <w:t>Not conducted / pending</w:t>
+              <w:t>PDF</w:t>
             </w:r>
           </w:p>
         </w:tc>
@@ -5385,7 +5378,7 @@
           </w:tcPr>
           <w:p>
             <w:r>
-              <w:t>Not conducted / pending</w:t>
+              <w:t>Working satisfactorily</w:t>
             </w:r>
           </w:p>
         </w:tc>
@@ -5407,7 +5400,7 @@
           </w:tcPr>
           <w:p>
             <w:r>
-              <w:t>Not conducted / pending</w:t>
+              <w:t>No outstanding issue reported</w:t>
             </w:r>
           </w:p>
         </w:tc>
@@ -5429,7 +5422,7 @@
           </w:tcPr>
           <w:p>
             <w:r>
-              <w:t>Not conducted / pending</w:t>
+              <w:t>Staff approved; author confirmation dated 20 October 2026</w:t>
             </w:r>
           </w:p>
         </w:tc>
@@ -5440,7 +5433,7 @@
         <w:spacing w:after="110" w:line="288"/>
       </w:pPr>
       <w:r>
-        <w:t>No completed staff pilot testing is claimed. Development testing evidence consists of the supplied dummy statements, sample analysis workbooks, screenshots, and test documentation. Independent accuracy comparisons against manually calculated results or agency reports remain pending.</w:t>
+        <w:t>CA Vinod H Dandwani confirms that two files were manually checked and the checked results were 100% accurate. This is the author's reported result for those two files, not a claim of universal accuracy. No agency comparison is recorded.</w:t>
       </w:r>
     </w:p>
     <w:p>
@@ -6154,7 +6147,7 @@
         <w:spacing w:after="110" w:line="288"/>
       </w:pPr>
       <w:r>
-        <w:t>Prepared: 20 October 2026 (submission date to be confirmed)</w:t>
+        <w:t>Date: 20 October 2026</w:t>
       </w:r>
     </w:p>
     <w:sectPr>

</xml_diff>